<commit_message>
reuploading activity document since i uploaded the default one
</commit_message>
<xml_diff>
--- a/week4/Stage_1_SmartCare_v01_and_AI_Activity_Card.docx
+++ b/week4/Stage_1_SmartCare_v01_and_AI_Activity_Card.docx
@@ -48,11 +48,7 @@
         <w:t>1. Problem summary</w:t>
       </w:r>
     </w:p>
-    <w:p>
-      <w:r>
-        <w:t>Write approximately 100 words.</w:t>
-      </w:r>
-    </w:p>
+    <w:p/>
     <w:p>
       <w:r>
         <w:t xml:space="preserve">SmartCare Community Clinic currently relies on spreadsheets and paper records to manage patients, practitioners and appointments. This manual approach leads to duplicate bookings, difficulty locating patient records, inconsistent status information, limited visibility of practitioner availability and no reliable way to produce operational reports. The clinic wants a simple software system, not </w:t>
@@ -437,7 +433,15 @@
     </w:p>
     <w:p>
       <w:r>
-        <w:t>2. What time format is expected (e.g. 24-hour, AM/PM, with or without timezone).</w:t>
+        <w:t xml:space="preserve">2. What time format is expected (e.g. 24-hour, AM/PM, with or without </w:t>
+      </w:r>
+      <w:proofErr w:type="spellStart"/>
+      <w:r>
+        <w:t>timezone</w:t>
+      </w:r>
+      <w:proofErr w:type="spellEnd"/>
+      <w:r>
+        <w:t>).</w:t>
       </w:r>
     </w:p>
     <w:p>
@@ -473,6 +477,11 @@
       </w:r>
     </w:p>
     <w:p>
+      <w:r>
+        <w:t>Before asking AI, I already believed the code stored appointments correctly using a list of dictionaries, and I had already identified several problems myself through direct testing: blank patient names and None values crash the program, duplicate bookings are silently accepted, and data disappears when the program closes (see Part B, ai_usage.md).</w:t>
+      </w:r>
+    </w:p>
+    <w:p>
       <w:pPr>
         <w:pStyle w:val="Heading2"/>
       </w:pPr>
@@ -486,11 +495,21 @@
       </w:r>
     </w:p>
     <w:p>
+      <w:r>
+        <w:t>Prompt used: "Act as a Python tutor. I am learning introductory software technology. Here is a small appointment-booking function. 1. Explain what the code does. 2. Identify three limitations. 3. Suggest improvements. 4. Do not rewrite the whole application. 5. Ask me two questions to test my understanding." Full response logged in ai_usage.md, Part C.</w:t>
+      </w:r>
+    </w:p>
+    <w:p>
       <w:pPr>
         <w:pStyle w:val="Heading2"/>
       </w:pPr>
       <w:r>
         <w:t>Evaluate</w:t>
+      </w:r>
+    </w:p>
+    <w:p>
+      <w:r>
+        <w:t>AI's three limitations (incomplete validation, silent duplicates, no persistence) all matched limitations I had already found independently through my own testing in Part B, so I evaluated AI's feedback as accurate but not new information -- it confirmed rather than extended my understanding.</w:t>
       </w:r>
     </w:p>
     <w:tbl>
@@ -741,6 +760,38 @@
       </w:r>
     </w:p>
     <w:p>
+      <w:r>
+        <w:t xml:space="preserve">Accepted: adding validation for </w:t>
+      </w:r>
+      <w:proofErr w:type="spellStart"/>
+      <w:r>
+        <w:t>practitioner_name</w:t>
+      </w:r>
+      <w:proofErr w:type="spellEnd"/>
+      <w:r>
+        <w:t xml:space="preserve"> and </w:t>
+      </w:r>
+      <w:proofErr w:type="spellStart"/>
+      <w:r>
+        <w:t>appointment_time</w:t>
+      </w:r>
+      <w:proofErr w:type="spellEnd"/>
+      <w:r>
+        <w:t xml:space="preserve">, since testing proved these fields had no protection at all (see Part G). Rejected: the interactive menu/loop suggestion, since it wasn't required for Stage 1 and would add scope beyond the brief. Kept unverified: whether an interactive menu would actually be expected in a later stage </w:t>
+      </w:r>
+      <w:r>
+        <w:t xml:space="preserve">so </w:t>
+      </w:r>
+      <w:proofErr w:type="gramStart"/>
+      <w:r>
+        <w:t>its</w:t>
+      </w:r>
+      <w:proofErr w:type="gramEnd"/>
+      <w:r>
+        <w:t xml:space="preserve"> noted as an open question rather than acted on.</w:t>
+      </w:r>
+    </w:p>
+    <w:p>
       <w:pPr>
         <w:pStyle w:val="Heading2"/>
       </w:pPr>
@@ -761,6 +812,14 @@
         <w:pStyle w:val="ListBullet"/>
       </w:pPr>
       <w:r>
+        <w:t>Ran smartcare_v01.py directly in VS Code -- confirmed it runs start to finish with no errors on normal input.</w:t>
+      </w:r>
+    </w:p>
+    <w:p>
+      <w:pPr>
+        <w:pStyle w:val="ListBullet"/>
+      </w:pPr>
+      <w:r>
         <w:t>Test normal input</w:t>
       </w:r>
     </w:p>
@@ -769,7 +828,48 @@
         <w:pStyle w:val="ListBullet"/>
       </w:pPr>
       <w:r>
+        <w:t xml:space="preserve">Ran </w:t>
+      </w:r>
+      <w:proofErr w:type="spellStart"/>
+      <w:r>
+        <w:t>book_</w:t>
+      </w:r>
+      <w:proofErr w:type="gramStart"/>
+      <w:r>
+        <w:t>appointment</w:t>
+      </w:r>
+      <w:proofErr w:type="spellEnd"/>
+      <w:r>
+        <w:t>(</w:t>
+      </w:r>
+      <w:proofErr w:type="gramEnd"/>
+      <w:r>
+        <w:t>) with normal values (e.g. 'Red John', 'Dr. Patrick Jane', '2026-09-11 10:00 AM') -- booked and displayed correctly with no errors.</w:t>
+      </w:r>
+    </w:p>
+    <w:p>
+      <w:pPr>
+        <w:pStyle w:val="ListBullet"/>
+      </w:pPr>
+      <w:r>
+        <w:lastRenderedPageBreak/>
         <w:t>Test unusual input</w:t>
+      </w:r>
+    </w:p>
+    <w:p>
+      <w:pPr>
+        <w:pStyle w:val="ListBullet"/>
+      </w:pPr>
+      <w:r>
+        <w:t xml:space="preserve">Tested blank patient name, an exact duplicate booking, and None values for all three fields. Blank name and None both crashed with </w:t>
+      </w:r>
+      <w:proofErr w:type="spellStart"/>
+      <w:r>
+        <w:t>ValueError</w:t>
+      </w:r>
+      <w:proofErr w:type="spellEnd"/>
+      <w:r>
+        <w:t xml:space="preserve"> before my Part G fix; duplicates were silently accepted with no warning. Full results logged in ai_usage.md, Part F.</w:t>
       </w:r>
     </w:p>
     <w:p>
@@ -785,6 +885,14 @@
         <w:pStyle w:val="ListBullet"/>
       </w:pPr>
       <w:r>
+        <w:t>Compared against the case study's stated requirement ("each appointment records patient name, practitioner name and appointment time") -- confirmed all three fields are captured, but noted the requirement doesn't specify whether they should be validated, which is why this was flagged as unclear in the Engineering Brief.</w:t>
+      </w:r>
+    </w:p>
+    <w:p>
+      <w:pPr>
+        <w:pStyle w:val="ListBullet"/>
+      </w:pPr>
+      <w:r>
         <w:t>Ask tutor/peer</w:t>
       </w:r>
     </w:p>
@@ -793,7 +901,23 @@
         <w:pStyle w:val="ListBullet"/>
       </w:pPr>
       <w:r>
+        <w:t>Not used for this activity -- relied on direct testing instead, which gave clearer, more specific evidence than asking a tutor or peer would have.</w:t>
+      </w:r>
+    </w:p>
+    <w:p>
+      <w:pPr>
+        <w:pStyle w:val="ListBullet"/>
+      </w:pPr>
+      <w:r>
         <w:t>Check documentation</w:t>
+      </w:r>
+    </w:p>
+    <w:p>
+      <w:pPr>
+        <w:pStyle w:val="ListBullet"/>
+      </w:pPr>
+      <w:r>
+        <w:t>Not needed for this stage -- the functions used (lists, dictionaries, if-statements, raise) are standard Python covered in the unit materials, so no external documentation lookup was required beyond W3Schools for basic syntax confirmation.</w:t>
       </w:r>
     </w:p>
     <w:p>
@@ -807,6 +931,49 @@
     <w:p>
       <w:r>
         <w:t>Can I explain the final code without reading the AI response? What do I still need to understand?</w:t>
+      </w:r>
+    </w:p>
+    <w:p>
+      <w:r>
+        <w:t>Yes</w:t>
+      </w:r>
+      <w:r>
+        <w:t xml:space="preserve">, </w:t>
+      </w:r>
+      <w:r>
+        <w:t xml:space="preserve">I can explain </w:t>
+      </w:r>
+      <w:proofErr w:type="spellStart"/>
+      <w:r>
+        <w:t>book_</w:t>
+      </w:r>
+      <w:proofErr w:type="gramStart"/>
+      <w:r>
+        <w:t>appointment</w:t>
+      </w:r>
+      <w:proofErr w:type="spellEnd"/>
+      <w:r>
+        <w:t>(</w:t>
+      </w:r>
+      <w:proofErr w:type="gramEnd"/>
+      <w:r>
+        <w:t xml:space="preserve">) and </w:t>
+      </w:r>
+      <w:proofErr w:type="spellStart"/>
+      <w:r>
+        <w:t>display_</w:t>
+      </w:r>
+      <w:proofErr w:type="gramStart"/>
+      <w:r>
+        <w:t>appointments</w:t>
+      </w:r>
+      <w:proofErr w:type="spellEnd"/>
+      <w:r>
+        <w:t>(</w:t>
+      </w:r>
+      <w:proofErr w:type="gramEnd"/>
+      <w:r>
+        <w:t>) without referring back to AI's response, including why a list of dictionaries was used and why validation was added. What I still need to understand better: how to persist data between program runs (e.g. writing to a file or database), which was flagged as a limitation but not solved in this stage.</w:t>
       </w:r>
     </w:p>
     <w:sectPr>

</xml_diff>